<commit_message>
Fix continuity: Antoine's birth date (ep43), Gaston's age in 1990 (ep46)
Co-Authored-By: Claude Sonnet 5.5 <noreply@anthropic.com>
Claude-Session: https://claude.ai/code/session_016yuGLRgHQJz1ZWi5RCZoZ6
</commit_message>
<xml_diff>
--- a/part4/ep43_Chez_le_notaire.docx
+++ b/part4/ep43_Chez_le_notaire.docx
@@ -656,7 +656,7 @@
           <w:sz w:val="22"/>
         </w:rPr>
         <w:tab/>
-        <w:t>« Et Madame Léa FONTAINE, directrice artistique, née à Lyon le dix-huit août mille neuf cent quatre-vingt-treize, et Monsieur Antoine DELCOURT, professeur agrégé d'histoire, né à Saumur le quatre juin mille neuf cent quatre-vingt-onze, ci-après dénommés « LES CESSIONNAIRES », d'autre part. »</w:t>
+        <w:t>« Et Madame Léa FONTAINE, directrice artistique, née à Lyon le dix-huit août mille neuf cent quatre-vingt-treize, et Monsieur Antoine DELCOURT, professeur agrégé d'histoire, né à Saumur le quatre janvier mille neuf cent quatre-vingt-onze, ci-après dénommés « LES CESSIONNAIRES », d'autre part. »</w:t>
       </w:r>
     </w:p>
     <w:p>
@@ -6064,7 +6064,7 @@
           <w:sz w:val="21"/>
         </w:rPr>
         <w:tab/>
-        <w:t>'그리고 아트 디렉터 레아 퐁텐, 1993년 8월 18일 리옹 출생, 역사 교사 앙투안 델쿠르, 1991년 6월 4일 소뮈르 출생, 이하 "양수인"이라 한다. 타방.'</w:t>
+        <w:t>'그리고 아트 디렉터 레아 퐁텐, 1993년 8월 18일 리옹 출생, 역사 교사 앙투안 델쿠르, 1991년 1월 4일 소뮈르 출생, 이하 "양수인"이라 한다. 타방.'</w:t>
       </w:r>
     </w:p>
     <w:p>

</xml_diff>